<commit_message>
Update publication reward template to current production version
</commit_message>
<xml_diff>
--- a/templates/publication_reward_template.docx
+++ b/templates/publication_reward_template.docx
@@ -135,12 +135,9 @@
           <w:szCs w:val="30"/>
           <w:cs/>
         </w:rPr>
-        <w:t>เงินรางวัลการตีพิมพ์เผยแพร่ผลงานวิจัยที่ได้รับการตีพิมพ์ในสาขาวิทยาศาสตร์และเทคโนโลยี</w:t>
-      </w:r>
-    </w:p>
-    <w:p>
-      <w:pPr>
-        <w:jc w:val="right"/>
+        <w:t>เงินรางวัล</w:t>
+      </w:r>
+      <w:r>
         <w:rPr>
           <w:rFonts w:ascii="TH Sarabun New" w:hAnsi="TH Sarabun New" w:cs="TH Sarabun New"/>
           <w:b/>
@@ -149,6 +146,102 @@
           <w:sz w:val="30"/>
           <w:szCs w:val="30"/>
         </w:rPr>
+        <w:t>/</w:t>
+      </w:r>
+      <w:r>
+        <w:rPr>
+          <w:rFonts w:ascii="TH Sarabun New" w:hAnsi="TH Sarabun New" w:cs="TH Sarabun New"/>
+          <w:b/>
+          <w:bCs/>
+          <w:color w:val="000000"/>
+          <w:sz w:val="30"/>
+          <w:szCs w:val="30"/>
+          <w:cs/>
+        </w:rPr>
+        <w:t>เงินสมทบค่าธรรมเนียมที่ทางวารสารเรียกเก็บสำหรับการตีพิมพ์ (</w:t>
+      </w:r>
+      <w:r>
+        <w:rPr>
+          <w:rFonts w:ascii="TH Sarabun New" w:hAnsi="TH Sarabun New" w:cs="TH Sarabun New"/>
+          <w:b/>
+          <w:bCs/>
+          <w:color w:val="000000"/>
+          <w:sz w:val="30"/>
+          <w:szCs w:val="30"/>
+        </w:rPr>
+        <w:t>Page Charge)</w:t>
+      </w:r>
+      <w:r>
+        <w:rPr>
+          <w:rFonts w:ascii="TH Sarabun New" w:hAnsi="TH Sarabun New" w:cs="TH Sarabun New" w:hint="cs"/>
+          <w:b/>
+          <w:bCs/>
+          <w:color w:val="000000"/>
+          <w:sz w:val="30"/>
+          <w:szCs w:val="30"/>
+          <w:cs/>
+        </w:rPr>
+        <w:t xml:space="preserve"> </w:t>
+      </w:r>
+      <w:r>
+        <w:rPr>
+          <w:rFonts w:ascii="TH Sarabun New" w:hAnsi="TH Sarabun New" w:cs="TH Sarabun New"/>
+          <w:b/>
+          <w:bCs/>
+          <w:color w:val="000000"/>
+          <w:sz w:val="30"/>
+          <w:szCs w:val="30"/>
+          <w:cs/>
+        </w:rPr>
+        <w:t>และค่าปรับปรุงบทความ (</w:t>
+      </w:r>
+      <w:r>
+        <w:rPr>
+          <w:rFonts w:ascii="TH Sarabun New" w:hAnsi="TH Sarabun New" w:cs="TH Sarabun New"/>
+          <w:b/>
+          <w:bCs/>
+          <w:color w:val="000000"/>
+          <w:sz w:val="30"/>
+          <w:szCs w:val="30"/>
+        </w:rPr>
+        <w:t>Manuscript Editing Service)</w:t>
+      </w:r>
+      <w:r>
+        <w:rPr>
+          <w:rFonts w:ascii="TH Sarabun New" w:hAnsi="TH Sarabun New" w:cs="TH Sarabun New" w:hint="cs"/>
+          <w:b/>
+          <w:bCs/>
+          <w:color w:val="000000"/>
+          <w:sz w:val="30"/>
+          <w:szCs w:val="30"/>
+          <w:cs/>
+        </w:rPr>
+        <w:t xml:space="preserve"> </w:t>
+      </w:r>
+      <w:r>
+        <w:rPr>
+          <w:rFonts w:ascii="TH Sarabun New" w:hAnsi="TH Sarabun New" w:cs="TH Sarabun New"/>
+          <w:b/>
+          <w:bCs/>
+          <w:color w:val="000000"/>
+          <w:sz w:val="30"/>
+          <w:szCs w:val="30"/>
+          <w:cs/>
+        </w:rPr>
+        <w:t>เผยแพร่ผลงานวิจัยที่ได้รับการตีพิมพ์ในสาขาวิทยาศาสตร์และเทคโนโลยี</w:t>
+      </w:r>
+    </w:p>
+    <w:p>
+      <w:pPr>
+        <w:jc w:val="right"/>
+        <w:rPr>
+          <w:rFonts w:ascii="TH Sarabun New" w:hAnsi="TH Sarabun New" w:cs="TH Sarabun New"/>
+          <w:b/>
+          <w:bCs/>
+          <w:color w:val="000000"/>
+          <w:sz w:val="30"/>
+          <w:szCs w:val="30"/>
+        </w:rPr>
       </w:pPr>
     </w:p>
     <w:p>
@@ -380,16 +473,16 @@
           <w:szCs w:val="28"/>
           <w:cs/>
         </w:rPr>
-        <w:t xml:space="preserve">             </w:t>
-      </w:r>
-      <w:r>
-        <w:rPr>
-          <w:rFonts w:ascii="TH Sarabun New" w:hAnsi="TH Sarabun New" w:cs="TH Sarabun New"/>
-          <w:sz w:val="28"/>
-          <w:szCs w:val="28"/>
-          <w:cs/>
-        </w:rPr>
-        <w:t xml:space="preserve"> ตำแหน่ง </w:t>
+        <w:t xml:space="preserve"> </w:t>
+      </w:r>
+      <w:r>
+        <w:rPr>
+          <w:rFonts w:ascii="TH Sarabun New" w:hAnsi="TH Sarabun New" w:cs="TH Sarabun New"/>
+          <w:sz w:val="28"/>
+          <w:szCs w:val="28"/>
+          <w:cs/>
+        </w:rPr>
+        <w:t xml:space="preserve">ตำแหน่ง </w:t>
       </w:r>
       <w:r>
         <w:rPr>
@@ -555,24 +648,15 @@
           <w:sz w:val="28"/>
           <w:szCs w:val="28"/>
         </w:rPr>
-        <w:t>. 25</w:t>
-      </w:r>
-      <w:r>
-        <w:rPr>
-          <w:rFonts w:ascii="TH Sarabun New" w:hAnsi="TH Sarabun New" w:cs="TH Sarabun New" w:hint="cs"/>
-          <w:sz w:val="28"/>
-          <w:szCs w:val="28"/>
-          <w:cs/>
-        </w:rPr>
-        <w:t>6</w:t>
-      </w:r>
-      <w:r>
-        <w:rPr>
-          <w:rFonts w:ascii="TH Sarabun New" w:hAnsi="TH Sarabun New" w:cs="TH Sarabun New"/>
-          <w:sz w:val="28"/>
-          <w:szCs w:val="28"/>
-        </w:rPr>
-        <w:t>8</w:t>
+        <w:t xml:space="preserve">. </w:t>
+      </w:r>
+      <w:r>
+        <w:rPr>
+          <w:rFonts w:ascii="TH Sarabun New" w:hAnsi="TH Sarabun New" w:cs="TH Sarabun New"/>
+          <w:sz w:val="28"/>
+          <w:szCs w:val="28"/>
+        </w:rPr>
+        <w:t>{{kku_report_year}}</w:t>
       </w:r>
       <w:r>
         <w:rPr>
@@ -754,16 +838,42 @@
           <w:szCs w:val="28"/>
           <w:cs/>
         </w:rPr>
-        <w:t>เป็นค่า</w:t>
-      </w:r>
-      <w:r>
-        <w:rPr>
-          <w:rFonts w:ascii="TH Sarabun New" w:hAnsi="TH Sarabun New" w:cs="TH Sarabun New"/>
-          <w:sz w:val="28"/>
-          <w:szCs w:val="28"/>
-          <w:cs/>
-        </w:rPr>
-        <w:t>ตอบแทนผลงานวิจัยที่ได้รับการตีพิมพ์ในวารสา</w:t>
+        <w:t>เป็น</w:t>
+      </w:r>
+      <w:r>
+        <w:rPr>
+          <w:rFonts w:ascii="TH Sarabun New" w:hAnsi="TH Sarabun New" w:cs="TH Sarabun New" w:hint="cs"/>
+          <w:sz w:val="28"/>
+          <w:szCs w:val="28"/>
+          <w:cs/>
+        </w:rPr>
+        <w:t>เงินรางวัล</w:t>
+      </w:r>
+      <w:r>
+        <w:rPr>
+          <w:rFonts w:ascii="TH Sarabun New" w:hAnsi="TH Sarabun New" w:cs="TH Sarabun New"/>
+          <w:sz w:val="28"/>
+          <w:szCs w:val="28"/>
+        </w:rPr>
+        <w:t>/</w:t>
+      </w:r>
+      <w:r>
+        <w:rPr>
+          <w:rFonts w:ascii="TH Sarabun New" w:hAnsi="TH Sarabun New" w:cs="TH Sarabun New"/>
+          <w:sz w:val="28"/>
+          <w:szCs w:val="28"/>
+          <w:cs/>
+        </w:rPr>
+        <w:t>เงินสมทบค่าธรรมเนียมที่ทางวารสารเรียกเก็บสำหรับการตีพิมพ์</w:t>
+      </w:r>
+      <w:r>
+        <w:rPr>
+          <w:rFonts w:ascii="TH Sarabun New" w:hAnsi="TH Sarabun New" w:cs="TH Sarabun New"/>
+          <w:sz w:val="28"/>
+          <w:szCs w:val="28"/>
+          <w:cs/>
+        </w:rPr>
+        <w:t>ผลงานวิจัยที่ได้รับการตีพิมพ์ในวารสา</w:t>
       </w:r>
       <w:r>
         <w:rPr>
@@ -919,7 +1029,7 @@
           <w:szCs w:val="28"/>
           <w:cs/>
         </w:rPr>
-        <w:t xml:space="preserve">ข้าพเจ้า     </w:t>
+        <w:t xml:space="preserve">ข้าพเจ้า </w:t>
       </w:r>
       <w:r>
         <w:rPr>
@@ -981,13 +1091,12 @@
           <w:rFonts w:ascii="TH Sarabun New" w:hAnsi="TH Sarabun New" w:cs="TH Sarabun New"/>
           <w:sz w:val="28"/>
           <w:szCs w:val="28"/>
-          <w:cs/>
         </w:rPr>
       </w:pPr>
     </w:p>
     <w:p>
       <w:pPr>
-        <w:ind w:right="43" w:firstLine="720"/>
+        <w:ind w:right="43"/>
         <w:jc w:val="thaiDistribute"/>
         <w:rPr>
           <w:rFonts w:ascii="TH Sarabun New" w:hAnsi="TH Sarabun New" w:cs="TH Sarabun New"/>
@@ -998,90 +1107,337 @@
       <w:r>
         <w:rPr>
           <w:rFonts w:ascii="TH Sarabun New" w:hAnsi="TH Sarabun New" w:cs="TH Sarabun New"/>
-          <w:sz w:val="28"/>
-          <w:szCs w:val="28"/>
-          <w:cs/>
-        </w:rPr>
-        <w:t>ทั้งนี้ได้แนบ</w:t>
-      </w:r>
-      <w:r>
-        <w:rPr>
-          <w:rFonts w:ascii="TH Sarabun New" w:hAnsi="TH Sarabun New" w:cs="TH Sarabun New"/>
-          <w:sz w:val="28"/>
-          <w:szCs w:val="28"/>
-        </w:rPr>
-        <w:t xml:space="preserve"> </w:t>
-      </w:r>
-      <w:r>
-        <w:rPr>
-          <w:rFonts w:ascii="TH Sarabun New" w:hAnsi="TH Sarabun New" w:cs="TH Sarabun New" w:hint="cs"/>
-          <w:sz w:val="28"/>
-          <w:szCs w:val="28"/>
-          <w:cs/>
-        </w:rPr>
-        <w:t>หลักฐาน</w:t>
-      </w:r>
-      <w:r>
-        <w:rPr>
-          <w:rFonts w:ascii="TH Sarabun New" w:hAnsi="TH Sarabun New" w:cs="TH Sarabun New" w:hint="cs"/>
-          <w:sz w:val="28"/>
-          <w:szCs w:val="28"/>
-          <w:cs/>
-        </w:rPr>
-        <w:t>เพื่อประกอบการพิจารณา ดัง</w:t>
-      </w:r>
-      <w:r>
-        <w:rPr>
-          <w:rFonts w:ascii="TH Sarabun New" w:hAnsi="TH Sarabun New" w:cs="TH Sarabun New" w:hint="cs"/>
-          <w:sz w:val="28"/>
-          <w:szCs w:val="28"/>
-          <w:cs/>
-        </w:rPr>
-        <w:t>นี้</w:t>
+          <w:b/>
+          <w:bCs/>
+          <w:sz w:val="28"/>
+          <w:szCs w:val="28"/>
+          <w:cs/>
+        </w:rPr>
+        <w:t>ค่าปรับปรุงบทความและค่าธรรมเนียมการตีพิมพ์</w:t>
       </w:r>
     </w:p>
     <w:p>
       <w:pPr>
-        <w:ind w:right="43" w:firstLine="720"/>
+        <w:ind w:right="43"/>
+        <w:jc w:val="thaiDistribute"/>
+        <w:rPr>
+          <w:rFonts w:ascii="TH Sarabun New" w:hAnsi="TH Sarabun New" w:cs="TH Sarabun New"/>
+          <w:sz w:val="28"/>
+          <w:szCs w:val="28"/>
+          <w:cs/>
+        </w:rPr>
+      </w:pPr>
+      <w:r>
+        <w:rPr>
+          <w:rFonts w:ascii="TH Sarabun New" w:hAnsi="TH Sarabun New" w:cs="TH Sarabun New"/>
+          <w:sz w:val="28"/>
+          <w:szCs w:val="28"/>
+          <w:cs/>
+        </w:rPr>
+        <w:t>ค่าธรรมเนียมที่ทางวารสารเรียกเก็บสำหรับการตีพิมพ์ (</w:t>
+      </w:r>
+      <w:r>
+        <w:rPr>
+          <w:rFonts w:ascii="TH Sarabun New" w:hAnsi="TH Sarabun New" w:cs="TH Sarabun New"/>
+          <w:sz w:val="28"/>
+          <w:szCs w:val="28"/>
+        </w:rPr>
+        <w:t>Page Charge)</w:t>
+      </w:r>
+      <w:r>
+        <w:rPr>
+          <w:rFonts w:ascii="TH Sarabun New" w:hAnsi="TH Sarabun New" w:cs="TH Sarabun New"/>
+          <w:sz w:val="28"/>
+          <w:szCs w:val="28"/>
+        </w:rPr>
+        <w:t xml:space="preserve"> {{page_charge_amount}} </w:t>
+      </w:r>
+      <w:r>
         <w:rPr>
           <w:rFonts w:ascii="TH Sarabun New" w:hAnsi="TH Sarabun New" w:cs="TH Sarabun New" w:hint="cs"/>
           <w:sz w:val="28"/>
           <w:szCs w:val="28"/>
           <w:cs/>
         </w:rPr>
-      </w:pPr>
-      <w:r>
-        <w:rPr>
-          <w:rFonts w:ascii="TH Sarabun New" w:hAnsi="TH Sarabun New" w:cs="TH Sarabun New"/>
-          <w:color w:val="000000"/>
-          <w:sz w:val="28"/>
-        </w:rPr>
-        <w:t>{{document</w:t>
-      </w:r>
-      <w:r>
-        <w:rPr>
-          <w:rFonts w:ascii="TH Sarabun New" w:hAnsi="TH Sarabun New" w:cs="TH Sarabun New"/>
-          <w:color w:val="000000"/>
-          <w:sz w:val="28"/>
-        </w:rPr>
-        <w:t>_line</w:t>
-      </w:r>
-      <w:r>
-        <w:rPr>
-          <w:rFonts w:ascii="TH Sarabun New" w:hAnsi="TH Sarabun New" w:cs="TH Sarabun New"/>
-          <w:color w:val="000000"/>
-          <w:sz w:val="28"/>
-        </w:rPr>
-        <w:t>}}</w:t>
+        <w:t>บาท</w:t>
       </w:r>
     </w:p>
     <w:p>
       <w:pPr>
-        <w:rPr>
-          <w:rFonts w:ascii="TH Sarabun New" w:hAnsi="TH Sarabun New" w:cs="TH Sarabun New"/>
-          <w:sz w:val="28"/>
-          <w:szCs w:val="28"/>
-          <w:cs/>
+        <w:ind w:right="43"/>
+        <w:jc w:val="thaiDistribute"/>
+        <w:rPr>
+          <w:rFonts w:ascii="TH Sarabun New" w:hAnsi="TH Sarabun New" w:cs="TH Sarabun New"/>
+          <w:sz w:val="28"/>
+          <w:szCs w:val="28"/>
+        </w:rPr>
+      </w:pPr>
+      <w:r>
+        <w:rPr>
+          <w:rFonts w:ascii="TH Sarabun New" w:hAnsi="TH Sarabun New" w:cs="TH Sarabun New"/>
+          <w:sz w:val="28"/>
+          <w:szCs w:val="28"/>
+          <w:cs/>
+        </w:rPr>
+        <w:t>ค่าปรับปรุงบทความ</w:t>
+      </w:r>
+      <w:r>
+        <w:rPr>
+          <w:rFonts w:ascii="TH Sarabun New" w:hAnsi="TH Sarabun New" w:cs="TH Sarabun New"/>
+          <w:sz w:val="28"/>
+          <w:szCs w:val="28"/>
+        </w:rPr>
+        <w:t xml:space="preserve"> </w:t>
+      </w:r>
+      <w:r>
+        <w:rPr>
+          <w:rFonts w:ascii="TH Sarabun New" w:hAnsi="TH Sarabun New" w:cs="TH Sarabun New"/>
+          <w:sz w:val="28"/>
+          <w:szCs w:val="28"/>
+        </w:rPr>
+        <w:t>(Manuscript Editing Service)</w:t>
+      </w:r>
+      <w:r>
+        <w:rPr>
+          <w:rFonts w:ascii="TH Sarabun New" w:hAnsi="TH Sarabun New" w:cs="TH Sarabun New"/>
+          <w:sz w:val="28"/>
+          <w:szCs w:val="28"/>
+        </w:rPr>
+        <w:t xml:space="preserve"> {{manuscript_amount}} </w:t>
+      </w:r>
+      <w:r>
+        <w:rPr>
+          <w:rFonts w:ascii="TH Sarabun New" w:hAnsi="TH Sarabun New" w:cs="TH Sarabun New" w:hint="cs"/>
+          <w:sz w:val="28"/>
+          <w:szCs w:val="28"/>
+          <w:cs/>
+        </w:rPr>
+        <w:t>บาท</w:t>
+      </w:r>
+    </w:p>
+    <w:p>
+      <w:pPr>
+        <w:ind w:right="43"/>
+        <w:jc w:val="thaiDistribute"/>
+        <w:rPr>
+          <w:rFonts w:ascii="TH Sarabun New" w:hAnsi="TH Sarabun New" w:cs="TH Sarabun New"/>
+          <w:sz w:val="28"/>
+          <w:szCs w:val="28"/>
+        </w:rPr>
+      </w:pPr>
+      <w:r>
+        <w:rPr>
+          <w:rFonts w:ascii="TH Sarabun New" w:hAnsi="TH Sarabun New" w:cs="TH Sarabun New" w:hint="cs"/>
+          <w:sz w:val="28"/>
+          <w:szCs w:val="28"/>
+          <w:cs/>
+        </w:rPr>
+        <w:t>รวม</w:t>
+      </w:r>
+      <w:r>
+        <w:rPr>
+          <w:rFonts w:ascii="TH Sarabun New" w:hAnsi="TH Sarabun New" w:cs="TH Sarabun New"/>
+          <w:sz w:val="28"/>
+          <w:szCs w:val="28"/>
+          <w:cs/>
+        </w:rPr>
+        <w:t>ค่าปรับปรุงบทความและค่าธรรมเนียมการตีพิมพ์</w:t>
+      </w:r>
+      <w:r>
+        <w:rPr>
+          <w:rFonts w:ascii="TH Sarabun New" w:hAnsi="TH Sarabun New" w:cs="TH Sarabun New" w:hint="cs"/>
+          <w:sz w:val="28"/>
+          <w:szCs w:val="28"/>
+          <w:cs/>
+        </w:rPr>
+        <w:t xml:space="preserve"> </w:t>
+      </w:r>
+      <w:r>
+        <w:rPr>
+          <w:rFonts w:ascii="TH Sarabun New" w:hAnsi="TH Sarabun New" w:cs="TH Sarabun New"/>
+          <w:sz w:val="28"/>
+          <w:szCs w:val="28"/>
+        </w:rPr>
+        <w:t>{{</w:t>
+      </w:r>
+      <w:r>
+        <w:rPr>
+          <w:rFonts w:ascii="TH Sarabun New" w:hAnsi="TH Sarabun New" w:cs="TH Sarabun New"/>
+          <w:sz w:val="28"/>
+          <w:szCs w:val="28"/>
+        </w:rPr>
+        <w:t>page_charge_manuscript_total}}</w:t>
+      </w:r>
+      <w:r>
+        <w:rPr>
+          <w:rFonts w:ascii="TH Sarabun New" w:hAnsi="TH Sarabun New" w:cs="TH Sarabun New"/>
+          <w:sz w:val="28"/>
+          <w:szCs w:val="28"/>
+        </w:rPr>
+        <w:t xml:space="preserve"> </w:t>
+      </w:r>
+      <w:r>
+        <w:rPr>
+          <w:rFonts w:ascii="TH Sarabun New" w:hAnsi="TH Sarabun New" w:cs="TH Sarabun New" w:hint="cs"/>
+          <w:sz w:val="28"/>
+          <w:szCs w:val="28"/>
+          <w:cs/>
+        </w:rPr>
+        <w:t>บาท</w:t>
+      </w:r>
+    </w:p>
+    <w:p>
+      <w:pPr>
+        <w:ind w:right="43"/>
+        <w:jc w:val="thaiDistribute"/>
+        <w:rPr>
+          <w:rFonts w:ascii="TH Sarabun New" w:hAnsi="TH Sarabun New" w:cs="TH Sarabun New"/>
+          <w:sz w:val="28"/>
+          <w:szCs w:val="28"/>
+          <w:cs/>
+        </w:rPr>
+      </w:pPr>
+    </w:p>
+    <w:p>
+      <w:pPr>
+        <w:ind w:right="43"/>
+        <w:jc w:val="thaiDistribute"/>
+        <w:rPr>
+          <w:rFonts w:ascii="TH Sarabun New" w:hAnsi="TH Sarabun New" w:cs="TH Sarabun New"/>
+          <w:b/>
+          <w:bCs/>
+          <w:sz w:val="28"/>
+          <w:szCs w:val="28"/>
+        </w:rPr>
+      </w:pPr>
+      <w:r>
+        <w:rPr>
+          <w:rFonts w:ascii="TH Sarabun New" w:hAnsi="TH Sarabun New" w:cs="TH Sarabun New" w:hint="cs"/>
+          <w:b/>
+          <w:bCs/>
+          <w:sz w:val="28"/>
+          <w:szCs w:val="28"/>
+          <w:cs/>
+        </w:rPr>
+        <w:t>จำนวนเงินที่</w:t>
+      </w:r>
+      <w:r>
+        <w:rPr>
+          <w:rFonts w:ascii="TH Sarabun New" w:hAnsi="TH Sarabun New" w:cs="TH Sarabun New"/>
+          <w:b/>
+          <w:bCs/>
+          <w:sz w:val="28"/>
+          <w:szCs w:val="28"/>
+          <w:cs/>
+        </w:rPr>
+        <w:t>มหาวิทยาลัยหรือหน่วยงานภายนอกสนับสนุน</w:t>
+      </w:r>
+    </w:p>
+    <w:p>
+      <w:pPr>
+        <w:ind w:right="43"/>
+        <w:rPr>
+          <w:rFonts w:ascii="TH Sarabun New" w:hAnsi="TH Sarabun New" w:cs="TH Sarabun New"/>
+          <w:sz w:val="28"/>
+          <w:szCs w:val="28"/>
+          <w:cs/>
+        </w:rPr>
+      </w:pPr>
+      <w:r>
+        <w:rPr>
+          <w:rFonts w:ascii="TH Sarabun New" w:hAnsi="TH Sarabun New" w:cs="TH Sarabun New"/>
+          <w:sz w:val="28"/>
+          <w:szCs w:val="28"/>
+        </w:rPr>
+        <w:t>{{external_</w:t>
+      </w:r>
+      <w:r>
+        <w:rPr>
+          <w:rFonts w:ascii="TH Sarabun New" w:hAnsi="TH Sarabun New" w:cs="TH Sarabun New"/>
+          <w:sz w:val="28"/>
+          <w:szCs w:val="28"/>
+        </w:rPr>
+        <w:t>fund_list</w:t>
+      </w:r>
+      <w:r>
+        <w:rPr>
+          <w:rFonts w:ascii="TH Sarabun New" w:hAnsi="TH Sarabun New" w:cs="TH Sarabun New"/>
+          <w:sz w:val="28"/>
+          <w:szCs w:val="28"/>
+        </w:rPr>
+        <w:t>}}</w:t>
+      </w:r>
+    </w:p>
+    <w:p>
+      <w:pPr>
+        <w:ind w:right="43"/>
+        <w:jc w:val="thaiDistribute"/>
+        <w:rPr>
+          <w:rFonts w:ascii="TH Sarabun New" w:hAnsi="TH Sarabun New" w:cs="TH Sarabun New"/>
+          <w:sz w:val="28"/>
+          <w:szCs w:val="28"/>
+          <w:cs/>
+        </w:rPr>
+      </w:pPr>
+      <w:r>
+        <w:rPr>
+          <w:rFonts w:ascii="TH Sarabun New" w:hAnsi="TH Sarabun New" w:cs="TH Sarabun New" w:hint="cs"/>
+          <w:sz w:val="28"/>
+          <w:szCs w:val="28"/>
+          <w:cs/>
+        </w:rPr>
+        <w:t>รวม</w:t>
+      </w:r>
+      <w:r>
+        <w:rPr>
+          <w:rFonts w:ascii="TH Sarabun New" w:hAnsi="TH Sarabun New" w:cs="TH Sarabun New"/>
+          <w:sz w:val="28"/>
+          <w:szCs w:val="28"/>
+          <w:cs/>
+        </w:rPr>
+        <w:t>จำนวนเงินที่มหาวิทยาลัยหรือหน่วยงานภายนอกสนับสนุน</w:t>
+      </w:r>
+      <w:r>
+        <w:rPr>
+          <w:rFonts w:ascii="TH Sarabun New" w:hAnsi="TH Sarabun New" w:cs="TH Sarabun New" w:hint="cs"/>
+          <w:sz w:val="28"/>
+          <w:szCs w:val="28"/>
+          <w:cs/>
+        </w:rPr>
+        <w:t xml:space="preserve"> </w:t>
+      </w:r>
+      <w:r>
+        <w:rPr>
+          <w:rFonts w:ascii="TH Sarabun New" w:hAnsi="TH Sarabun New" w:cs="TH Sarabun New"/>
+          <w:sz w:val="28"/>
+          <w:szCs w:val="28"/>
+        </w:rPr>
+        <w:t>{{external_fund_total}}</w:t>
+      </w:r>
+      <w:r>
+        <w:rPr>
+          <w:rFonts w:ascii="TH Sarabun New" w:hAnsi="TH Sarabun New" w:cs="TH Sarabun New"/>
+          <w:sz w:val="28"/>
+          <w:szCs w:val="28"/>
+        </w:rPr>
+        <w:t xml:space="preserve"> </w:t>
+      </w:r>
+      <w:r>
+        <w:rPr>
+          <w:rFonts w:ascii="TH Sarabun New" w:hAnsi="TH Sarabun New" w:cs="TH Sarabun New" w:hint="cs"/>
+          <w:sz w:val="28"/>
+          <w:szCs w:val="28"/>
+          <w:cs/>
+        </w:rPr>
+        <w:t>บาท</w:t>
+      </w:r>
+    </w:p>
+    <w:p>
+      <w:pPr>
+        <w:rPr>
+          <w:rFonts w:ascii="TH Sarabun New" w:hAnsi="TH Sarabun New" w:cs="TH Sarabun New"/>
+          <w:sz w:val="28"/>
+          <w:szCs w:val="28"/>
         </w:rPr>
       </w:pPr>
       <w:r>
@@ -1093,6 +1449,114 @@
         </w:rPr>
         <w:br w:type="page"/>
       </w:r>
+    </w:p>
+    <w:p>
+      <w:pPr>
+        <w:ind w:right="43"/>
+        <w:jc w:val="thaiDistribute"/>
+        <w:rPr>
+          <w:rFonts w:ascii="TH Sarabun New" w:hAnsi="TH Sarabun New" w:cs="TH Sarabun New"/>
+          <w:sz w:val="28"/>
+          <w:szCs w:val="28"/>
+        </w:rPr>
+      </w:pPr>
+    </w:p>
+    <w:p>
+      <w:pPr>
+        <w:ind w:right="43"/>
+        <w:jc w:val="thaiDistribute"/>
+        <w:rPr>
+          <w:rFonts w:ascii="TH Sarabun New" w:hAnsi="TH Sarabun New" w:cs="TH Sarabun New"/>
+          <w:b/>
+          <w:bCs/>
+          <w:sz w:val="28"/>
+          <w:szCs w:val="28"/>
+        </w:rPr>
+      </w:pPr>
+      <w:r>
+        <w:rPr>
+          <w:rFonts w:ascii="TH Sarabun New" w:hAnsi="TH Sarabun New" w:cs="TH Sarabun New"/>
+          <w:b/>
+          <w:bCs/>
+          <w:sz w:val="28"/>
+          <w:szCs w:val="28"/>
+          <w:cs/>
+        </w:rPr>
+        <w:t>ทั้งนี้ได้แนบ</w:t>
+      </w:r>
+      <w:r>
+        <w:rPr>
+          <w:rFonts w:ascii="TH Sarabun New" w:hAnsi="TH Sarabun New" w:cs="TH Sarabun New"/>
+          <w:b/>
+          <w:bCs/>
+          <w:sz w:val="28"/>
+          <w:szCs w:val="28"/>
+        </w:rPr>
+        <w:t xml:space="preserve"> </w:t>
+      </w:r>
+      <w:r>
+        <w:rPr>
+          <w:rFonts w:ascii="TH Sarabun New" w:hAnsi="TH Sarabun New" w:cs="TH Sarabun New" w:hint="cs"/>
+          <w:b/>
+          <w:bCs/>
+          <w:sz w:val="28"/>
+          <w:szCs w:val="28"/>
+          <w:cs/>
+        </w:rPr>
+        <w:t>หลักฐาน</w:t>
+      </w:r>
+      <w:r>
+        <w:rPr>
+          <w:rFonts w:ascii="TH Sarabun New" w:hAnsi="TH Sarabun New" w:cs="TH Sarabun New" w:hint="cs"/>
+          <w:b/>
+          <w:bCs/>
+          <w:sz w:val="28"/>
+          <w:szCs w:val="28"/>
+          <w:cs/>
+        </w:rPr>
+        <w:t>เพื่อประกอบการพิจารณา ดัง</w:t>
+      </w:r>
+      <w:r>
+        <w:rPr>
+          <w:rFonts w:ascii="TH Sarabun New" w:hAnsi="TH Sarabun New" w:cs="TH Sarabun New" w:hint="cs"/>
+          <w:b/>
+          <w:bCs/>
+          <w:sz w:val="28"/>
+          <w:szCs w:val="28"/>
+          <w:cs/>
+        </w:rPr>
+        <w:t>นี้</w:t>
+      </w:r>
+    </w:p>
+    <w:p>
+      <w:pPr>
+        <w:ind w:right="43"/>
+        <w:jc w:val="thaiDistribute"/>
+        <w:rPr>
+          <w:rFonts w:ascii="TH Sarabun New" w:hAnsi="TH Sarabun New" w:cs="TH Sarabun New"/>
+          <w:sz w:val="28"/>
+          <w:szCs w:val="28"/>
+          <w:cs/>
+        </w:rPr>
+      </w:pPr>
+      <w:r>
+        <w:rPr>
+          <w:rFonts w:ascii="TH Sarabun New" w:hAnsi="TH Sarabun New" w:cs="TH Sarabun New"/>
+          <w:sz w:val="28"/>
+          <w:szCs w:val="28"/>
+        </w:rPr>
+        <w:t>{{document_line}}</w:t>
+      </w:r>
+    </w:p>
+    <w:p>
+      <w:pPr>
+        <w:rPr>
+          <w:rFonts w:ascii="TH Sarabun New" w:hAnsi="TH Sarabun New" w:cs="TH Sarabun New"/>
+          <w:sz w:val="28"/>
+          <w:szCs w:val="28"/>
+          <w:cs/>
+        </w:rPr>
+      </w:pPr>
     </w:p>
     <w:p>
       <w:pPr>
@@ -1113,16 +1577,6 @@
           <w:szCs w:val="28"/>
           <w:cs/>
         </w:rPr>
-        <w:lastRenderedPageBreak/>
-        <w:tab/>
-      </w:r>
-      <w:r>
-        <w:rPr>
-          <w:rFonts w:ascii="TH Sarabun New" w:hAnsi="TH Sarabun New" w:cs="TH Sarabun New"/>
-          <w:sz w:val="28"/>
-          <w:szCs w:val="28"/>
-          <w:cs/>
-        </w:rPr>
         <w:t xml:space="preserve">ข้าพเจ้าขอรับรองว่า </w:t>
       </w:r>
     </w:p>
@@ -1131,185 +1585,19 @@
         <w:tabs>
           <w:tab w:val="left" w:pos="720"/>
         </w:tabs>
-        <w:ind w:left="284" w:hanging="284"/>
-        <w:jc w:val="thaiDistribute"/>
-        <w:rPr>
-          <w:rFonts w:ascii="TH Sarabun New" w:hAnsi="TH Sarabun New" w:cs="TH Sarabun New"/>
-          <w:sz w:val="28"/>
-          <w:szCs w:val="28"/>
-        </w:rPr>
-      </w:pPr>
-      <w:r>
-        <w:rPr>
-          <w:rFonts w:ascii="Segoe UI Symbol" w:hAnsi="Segoe UI Symbol" w:cs="Segoe UI Symbol"/>
-          <w:sz w:val="28"/>
-          <w:szCs w:val="28"/>
-        </w:rPr>
-        <w:t>☑</w:t>
-      </w:r>
-      <w:r>
-        <w:rPr>
-          <w:rFonts w:ascii="TH Sarabun New" w:hAnsi="TH Sarabun New" w:cs="TH Sarabun New"/>
-          <w:sz w:val="28"/>
-          <w:szCs w:val="28"/>
-        </w:rPr>
-        <w:t xml:space="preserve"> </w:t>
-      </w:r>
-      <w:r>
-        <w:rPr>
-          <w:rFonts w:ascii="TH Sarabun New" w:hAnsi="TH Sarabun New" w:cs="TH Sarabun New" w:hint="cs"/>
-          <w:sz w:val="28"/>
-          <w:szCs w:val="28"/>
-          <w:cs/>
-        </w:rPr>
-        <w:t>ผลงานตีพิมพ์ที่ขอรับการสนับสนุน</w:t>
-      </w:r>
-      <w:r>
-        <w:rPr>
-          <w:rFonts w:ascii="TH Sarabun New" w:hAnsi="TH Sarabun New" w:cs="TH Sarabun New" w:hint="cs"/>
-          <w:sz w:val="28"/>
-          <w:szCs w:val="28"/>
-          <w:u w:val="single"/>
-          <w:cs/>
-        </w:rPr>
-        <w:t>ไม่</w:t>
-      </w:r>
-      <w:r>
-        <w:rPr>
-          <w:rFonts w:ascii="TH Sarabun New" w:hAnsi="TH Sarabun New" w:cs="TH Sarabun New" w:hint="cs"/>
-          <w:sz w:val="28"/>
-          <w:szCs w:val="28"/>
-          <w:u w:val="single"/>
-          <w:cs/>
-        </w:rPr>
-        <w:t>เคย</w:t>
-      </w:r>
-      <w:r>
-        <w:rPr>
-          <w:rFonts w:ascii="TH Sarabun New" w:hAnsi="TH Sarabun New" w:cs="TH Sarabun New" w:hint="cs"/>
-          <w:sz w:val="28"/>
-          <w:szCs w:val="28"/>
-          <w:cs/>
-        </w:rPr>
-        <w:t>ได้รับการจัดสรรทุนของมหาวิทยาลัย และทุนส่งเสริมการวิจัยจากกองทุน</w:t>
-      </w:r>
-      <w:r>
-        <w:rPr>
-          <w:rFonts w:ascii="TH Sarabun New" w:hAnsi="TH Sarabun New" w:cs="TH Sarabun New" w:hint="cs"/>
-          <w:sz w:val="28"/>
-          <w:szCs w:val="28"/>
-          <w:cs/>
-        </w:rPr>
-        <w:t xml:space="preserve">วิจัย </w:t>
-      </w:r>
-      <w:r>
-        <w:rPr>
-          <w:rFonts w:ascii="TH Sarabun New" w:hAnsi="TH Sarabun New" w:cs="TH Sarabun New"/>
-          <w:sz w:val="28"/>
-          <w:szCs w:val="28"/>
-          <w:cs/>
-        </w:rPr>
-        <w:t>นวัตกรรม และบริการวิชาการ วิทยาลัยการคอมพิวเตอร์</w:t>
-      </w:r>
-    </w:p>
-    <w:p>
-      <w:pPr>
-        <w:tabs>
-          <w:tab w:val="left" w:pos="720"/>
-        </w:tabs>
-        <w:ind w:left="284" w:hanging="284"/>
-        <w:jc w:val="thaiDistribute"/>
-        <w:rPr>
-          <w:rFonts w:ascii="TH Sarabun New" w:hAnsi="TH Sarabun New" w:cs="TH Sarabun New"/>
-          <w:sz w:val="28"/>
-          <w:szCs w:val="28"/>
-          <w:cs/>
-        </w:rPr>
-      </w:pPr>
-      <w:r>
-        <w:rPr>
-          <w:rFonts w:ascii="Segoe UI Symbol" w:hAnsi="Segoe UI Symbol" w:cs="Segoe UI Symbol"/>
-          <w:sz w:val="28"/>
-          <w:szCs w:val="28"/>
-        </w:rPr>
-        <w:t>☑</w:t>
-      </w:r>
-      <w:r>
-        <w:rPr>
-          <w:rFonts w:ascii="TH Sarabun New" w:hAnsi="TH Sarabun New" w:cs="TH Sarabun New"/>
-          <w:sz w:val="28"/>
-          <w:szCs w:val="28"/>
-        </w:rPr>
-        <w:t xml:space="preserve"> </w:t>
-      </w:r>
-      <w:r>
-        <w:rPr>
-          <w:rFonts w:ascii="TH Sarabun New" w:hAnsi="TH Sarabun New" w:cs="TH Sarabun New"/>
-          <w:sz w:val="28"/>
-          <w:szCs w:val="28"/>
-          <w:cs/>
-        </w:rPr>
-        <w:t>จะปฏิบัติตามระเบียบมหาวิทยาลัยขอนแก่น ว่าด้วยกองทุน</w:t>
-      </w:r>
-      <w:r>
-        <w:rPr>
-          <w:rFonts w:ascii="TH Sarabun New" w:hAnsi="TH Sarabun New" w:cs="TH Sarabun New" w:hint="cs"/>
-          <w:sz w:val="28"/>
-          <w:szCs w:val="28"/>
-          <w:cs/>
-        </w:rPr>
-        <w:t>วิจัยในระดับคณะ</w:t>
-      </w:r>
-      <w:r>
-        <w:rPr>
-          <w:rFonts w:ascii="TH Sarabun New" w:hAnsi="TH Sarabun New" w:cs="TH Sarabun New"/>
-          <w:sz w:val="28"/>
-          <w:szCs w:val="28"/>
-          <w:cs/>
-        </w:rPr>
-        <w:t xml:space="preserve"> พ</w:t>
-      </w:r>
-      <w:r>
-        <w:rPr>
-          <w:rFonts w:ascii="TH Sarabun New" w:hAnsi="TH Sarabun New" w:cs="TH Sarabun New"/>
-          <w:sz w:val="28"/>
-          <w:szCs w:val="28"/>
-        </w:rPr>
-        <w:t>.</w:t>
-      </w:r>
-      <w:r>
-        <w:rPr>
-          <w:rFonts w:ascii="TH Sarabun New" w:hAnsi="TH Sarabun New" w:cs="TH Sarabun New"/>
-          <w:sz w:val="28"/>
-          <w:szCs w:val="28"/>
-          <w:cs/>
-        </w:rPr>
-        <w:t>ศ</w:t>
-      </w:r>
-      <w:r>
-        <w:rPr>
-          <w:rFonts w:ascii="TH Sarabun New" w:hAnsi="TH Sarabun New" w:cs="TH Sarabun New"/>
-          <w:sz w:val="28"/>
-          <w:szCs w:val="28"/>
-        </w:rPr>
-        <w:t xml:space="preserve">. </w:t>
-      </w:r>
-      <w:r>
-        <w:rPr>
-          <w:rFonts w:ascii="TH Sarabun New" w:hAnsi="TH Sarabun New" w:cs="TH Sarabun New"/>
-          <w:sz w:val="28"/>
-          <w:szCs w:val="28"/>
-        </w:rPr>
-        <w:t xml:space="preserve">{{kku_report_year}} </w:t>
-      </w:r>
-      <w:r>
-        <w:rPr>
-          <w:rFonts w:ascii="TH Sarabun New" w:hAnsi="TH Sarabun New" w:cs="TH Sarabun New"/>
-          <w:sz w:val="28"/>
-          <w:szCs w:val="28"/>
-          <w:cs/>
-        </w:rPr>
-        <w:t>รวมถึงหลักเกณฑ์และประกาศอื่นใดที่เกี่ยวข้องทุกประการ</w:t>
+        <w:rPr>
+          <w:rFonts w:ascii="TH Sarabun New" w:hAnsi="TH Sarabun New" w:cs="TH Sarabun New"/>
+          <w:sz w:val="28"/>
+          <w:szCs w:val="28"/>
+        </w:rPr>
+      </w:pPr>
+      <w:r>
+        <w:rPr>
+          <w:rFonts w:ascii="TH Sarabun New" w:hAnsi="TH Sarabun New" w:cs="TH Sarabun New"/>
+          <w:sz w:val="28"/>
+          <w:szCs w:val="28"/>
+        </w:rPr>
+        <w:t>{{end_of_contract}}</w:t>
       </w:r>
     </w:p>
     <w:p>
@@ -3385,6 +3673,7 @@
   <w:style w:type="paragraph" w:default="1" w:styleId="Normal">
     <w:name w:val="Normal"/>
     <w:qFormat/>
+    <w:rsid w:val="0026033B"/>
     <w:rPr>
       <w:rFonts w:ascii="AngsanaUPC" w:hAnsi="AngsanaUPC" w:cs="AngsanaUPC"/>
       <w:sz w:val="40"/>

</xml_diff>

<commit_message>
feat(publication-reward): activate redesigned template as canonical + fix submit placeholders
CRITICAL: buildSubmissionPreviewReplacements (submission.go) — the builder for the
REAL document generated at submit — was missing the redesign placeholders
({{reward_amount}}, {{quartile}}, {{reward_received_note}}, {{net_topup_amount}},
{{external_fund_block}}, {{external_fund_total_negative}}, {{has_received_reward}}).
With the old template this was harmless, but swapping the template would have rendered
raw {{...}} in applicants' files. Added them (same detail-derived values as the preview
submission path) with a comment requiring the 3 builders stay in sync.

Template swap done in git so deploy = merge only (no server-side rename):
- publication_reward_template.docx  = redesigned fee-summary layout (was *_new.docx)
- publication_reward_template_backup.docx = previous design, kept as backup
Tests + docs updated to reference the canonical name.
</commit_message>
<xml_diff>
--- a/templates/publication_reward_template.docx
+++ b/templates/publication_reward_template.docx
@@ -89,7 +89,8 @@
           <w:szCs w:val="32"/>
           <w:cs/>
         </w:rPr>
-        <w:t xml:space="preserve"> วิทยาลัยการคอมพิวเตอร์</w:t>
+        <w:br/>
+        <w:t xml:space="preserve">วิทยาลัยการคอมพิวเตอร์</w:t>
       </w:r>
       <w:r>
         <w:rPr>
@@ -1100,210 +1101,6 @@
         <w:jc w:val="thaiDistribute"/>
         <w:rPr>
           <w:rFonts w:ascii="TH Sarabun New" w:hAnsi="TH Sarabun New" w:cs="TH Sarabun New"/>
-          <w:sz w:val="28"/>
-          <w:szCs w:val="28"/>
-        </w:rPr>
-      </w:pPr>
-      <w:r>
-        <w:rPr>
-          <w:rFonts w:ascii="TH Sarabun New" w:hAnsi="TH Sarabun New" w:cs="TH Sarabun New"/>
-          <w:b/>
-          <w:bCs/>
-          <w:sz w:val="28"/>
-          <w:szCs w:val="28"/>
-          <w:cs/>
-        </w:rPr>
-        <w:t>ค่าปรับปรุงบทความและค่าธรรมเนียมการตีพิมพ์</w:t>
-      </w:r>
-    </w:p>
-    <w:p>
-      <w:pPr>
-        <w:ind w:right="43"/>
-        <w:jc w:val="thaiDistribute"/>
-        <w:rPr>
-          <w:rFonts w:ascii="TH Sarabun New" w:hAnsi="TH Sarabun New" w:cs="TH Sarabun New"/>
-          <w:sz w:val="28"/>
-          <w:szCs w:val="28"/>
-          <w:cs/>
-        </w:rPr>
-      </w:pPr>
-      <w:r>
-        <w:rPr>
-          <w:rFonts w:ascii="TH Sarabun New" w:hAnsi="TH Sarabun New" w:cs="TH Sarabun New"/>
-          <w:sz w:val="28"/>
-          <w:szCs w:val="28"/>
-          <w:cs/>
-        </w:rPr>
-        <w:t>ค่าธรรมเนียมที่ทางวารสารเรียกเก็บสำหรับการตีพิมพ์ (</w:t>
-      </w:r>
-      <w:r>
-        <w:rPr>
-          <w:rFonts w:ascii="TH Sarabun New" w:hAnsi="TH Sarabun New" w:cs="TH Sarabun New"/>
-          <w:sz w:val="28"/>
-          <w:szCs w:val="28"/>
-        </w:rPr>
-        <w:t>Page Charge)</w:t>
-      </w:r>
-      <w:r>
-        <w:rPr>
-          <w:rFonts w:ascii="TH Sarabun New" w:hAnsi="TH Sarabun New" w:cs="TH Sarabun New"/>
-          <w:sz w:val="28"/>
-          <w:szCs w:val="28"/>
-        </w:rPr>
-        <w:t xml:space="preserve"> {{page_charge_amount}} </w:t>
-      </w:r>
-      <w:r>
-        <w:rPr>
-          <w:rFonts w:ascii="TH Sarabun New" w:hAnsi="TH Sarabun New" w:cs="TH Sarabun New" w:hint="cs"/>
-          <w:sz w:val="28"/>
-          <w:szCs w:val="28"/>
-          <w:cs/>
-        </w:rPr>
-        <w:t>บาท</w:t>
-      </w:r>
-    </w:p>
-    <w:p>
-      <w:pPr>
-        <w:ind w:right="43"/>
-        <w:jc w:val="thaiDistribute"/>
-        <w:rPr>
-          <w:rFonts w:ascii="TH Sarabun New" w:hAnsi="TH Sarabun New" w:cs="TH Sarabun New"/>
-          <w:sz w:val="28"/>
-          <w:szCs w:val="28"/>
-        </w:rPr>
-      </w:pPr>
-      <w:r>
-        <w:rPr>
-          <w:rFonts w:ascii="TH Sarabun New" w:hAnsi="TH Sarabun New" w:cs="TH Sarabun New"/>
-          <w:sz w:val="28"/>
-          <w:szCs w:val="28"/>
-          <w:cs/>
-        </w:rPr>
-        <w:t>ค่าปรับปรุงบทความ</w:t>
-      </w:r>
-      <w:r>
-        <w:rPr>
-          <w:rFonts w:ascii="TH Sarabun New" w:hAnsi="TH Sarabun New" w:cs="TH Sarabun New"/>
-          <w:sz w:val="28"/>
-          <w:szCs w:val="28"/>
-        </w:rPr>
-        <w:t xml:space="preserve"> </w:t>
-      </w:r>
-      <w:r>
-        <w:rPr>
-          <w:rFonts w:ascii="TH Sarabun New" w:hAnsi="TH Sarabun New" w:cs="TH Sarabun New"/>
-          <w:sz w:val="28"/>
-          <w:szCs w:val="28"/>
-        </w:rPr>
-        <w:t>(Manuscript Editing Service)</w:t>
-      </w:r>
-      <w:r>
-        <w:rPr>
-          <w:rFonts w:ascii="TH Sarabun New" w:hAnsi="TH Sarabun New" w:cs="TH Sarabun New"/>
-          <w:sz w:val="28"/>
-          <w:szCs w:val="28"/>
-        </w:rPr>
-        <w:t xml:space="preserve"> {{manuscript_amount}} </w:t>
-      </w:r>
-      <w:r>
-        <w:rPr>
-          <w:rFonts w:ascii="TH Sarabun New" w:hAnsi="TH Sarabun New" w:cs="TH Sarabun New" w:hint="cs"/>
-          <w:sz w:val="28"/>
-          <w:szCs w:val="28"/>
-          <w:cs/>
-        </w:rPr>
-        <w:t>บาท</w:t>
-      </w:r>
-    </w:p>
-    <w:p>
-      <w:pPr>
-        <w:ind w:right="43"/>
-        <w:jc w:val="thaiDistribute"/>
-        <w:rPr>
-          <w:rFonts w:ascii="TH Sarabun New" w:hAnsi="TH Sarabun New" w:cs="TH Sarabun New"/>
-          <w:sz w:val="28"/>
-          <w:szCs w:val="28"/>
-        </w:rPr>
-      </w:pPr>
-      <w:r>
-        <w:rPr>
-          <w:rFonts w:ascii="TH Sarabun New" w:hAnsi="TH Sarabun New" w:cs="TH Sarabun New" w:hint="cs"/>
-          <w:sz w:val="28"/>
-          <w:szCs w:val="28"/>
-          <w:cs/>
-        </w:rPr>
-        <w:t>รวม</w:t>
-      </w:r>
-      <w:r>
-        <w:rPr>
-          <w:rFonts w:ascii="TH Sarabun New" w:hAnsi="TH Sarabun New" w:cs="TH Sarabun New"/>
-          <w:sz w:val="28"/>
-          <w:szCs w:val="28"/>
-          <w:cs/>
-        </w:rPr>
-        <w:t>ค่าปรับปรุงบทความและค่าธรรมเนียมการตีพิมพ์</w:t>
-      </w:r>
-      <w:r>
-        <w:rPr>
-          <w:rFonts w:ascii="TH Sarabun New" w:hAnsi="TH Sarabun New" w:cs="TH Sarabun New" w:hint="cs"/>
-          <w:sz w:val="28"/>
-          <w:szCs w:val="28"/>
-          <w:cs/>
-        </w:rPr>
-        <w:t xml:space="preserve"> </w:t>
-      </w:r>
-      <w:r>
-        <w:rPr>
-          <w:rFonts w:ascii="TH Sarabun New" w:hAnsi="TH Sarabun New" w:cs="TH Sarabun New"/>
-          <w:sz w:val="28"/>
-          <w:szCs w:val="28"/>
-        </w:rPr>
-        <w:t>{{</w:t>
-      </w:r>
-      <w:r>
-        <w:rPr>
-          <w:rFonts w:ascii="TH Sarabun New" w:hAnsi="TH Sarabun New" w:cs="TH Sarabun New"/>
-          <w:sz w:val="28"/>
-          <w:szCs w:val="28"/>
-        </w:rPr>
-        <w:t>page_charge_manuscript_total}}</w:t>
-      </w:r>
-      <w:r>
-        <w:rPr>
-          <w:rFonts w:ascii="TH Sarabun New" w:hAnsi="TH Sarabun New" w:cs="TH Sarabun New"/>
-          <w:sz w:val="28"/>
-          <w:szCs w:val="28"/>
-        </w:rPr>
-        <w:t xml:space="preserve"> </w:t>
-      </w:r>
-      <w:r>
-        <w:rPr>
-          <w:rFonts w:ascii="TH Sarabun New" w:hAnsi="TH Sarabun New" w:cs="TH Sarabun New" w:hint="cs"/>
-          <w:sz w:val="28"/>
-          <w:szCs w:val="28"/>
-          <w:cs/>
-        </w:rPr>
-        <w:t>บาท</w:t>
-      </w:r>
-    </w:p>
-    <w:p>
-      <w:pPr>
-        <w:ind w:right="43"/>
-        <w:jc w:val="thaiDistribute"/>
-        <w:rPr>
-          <w:rFonts w:ascii="TH Sarabun New" w:hAnsi="TH Sarabun New" w:cs="TH Sarabun New"/>
-          <w:sz w:val="28"/>
-          <w:szCs w:val="28"/>
-          <w:cs/>
-        </w:rPr>
-      </w:pPr>
-    </w:p>
-    <w:p>
-      <w:pPr>
-        <w:ind w:right="43"/>
-        <w:jc w:val="thaiDistribute"/>
-        <w:rPr>
-          <w:rFonts w:ascii="TH Sarabun New" w:hAnsi="TH Sarabun New" w:cs="TH Sarabun New"/>
           <w:b/>
           <w:bCs/>
           <w:sz w:val="28"/>
@@ -1319,118 +1116,470 @@
           <w:szCs w:val="28"/>
           <w:cs/>
         </w:rPr>
-        <w:t>จำนวนเงินที่</w:t>
-      </w:r>
-      <w:r>
-        <w:rPr>
-          <w:rFonts w:ascii="TH Sarabun New" w:hAnsi="TH Sarabun New" w:cs="TH Sarabun New"/>
-          <w:b/>
-          <w:bCs/>
-          <w:sz w:val="28"/>
-          <w:szCs w:val="28"/>
-          <w:cs/>
-        </w:rPr>
-        <w:t>มหาวิทยาลัยหรือหน่วยงานภายนอกสนับสนุน</w:t>
+        <w:t xml:space="preserve">รายการการขอเบิก/จ่าย</w:t>
       </w:r>
     </w:p>
+    <w:tbl>
+      <w:tblPr>
+        <w:tblW w:w="9500" w:type="dxa"/>
+        <w:jc w:val="center"/>
+        <w:tblBorders>
+          <w:top w:val="single" w:sz="8" w:space="0" w:color="000000"/>
+          <w:bottom w:val="single" w:sz="16" w:space="0" w:color="000000"/>
+          <w:insideH w:val="single" w:sz="4" w:space="0" w:color="BFBFBF"/>
+        </w:tblBorders>
+        <w:tblCellMar>
+          <w:top w:w="40" w:type="dxa"/>
+          <w:bottom w:w="40" w:type="dxa"/>
+          <w:left w:w="80" w:type="dxa"/>
+          <w:right w:w="80" w:type="dxa"/>
+        </w:tblCellMar>
+      </w:tblPr>
+      <w:tblGrid>
+        <w:gridCol w:w="6900"/>
+        <w:gridCol w:w="2600"/>
+      </w:tblGrid>
+      <w:tr>
+        <w:tc>
+          <w:tcPr>
+            <w:tcW w:w="6900" w:type="dxa"/>
+            <w:vAlign w:val="center"/>
+          </w:tcPr>
+          <w:p>
+            <w:pPr>
+              <w:spacing w:before="30" w:after="30" w:line="240" w:lineRule="auto"/>
+              <w:ind w:right="0"/>
+              <w:jc w:val="left"/>
+            </w:pPr>
+            <w:r>
+              <w:rPr>
+                <w:rFonts w:ascii="TH Sarabun New" w:hAnsi="TH Sarabun New" w:cs="TH Sarabun New" w:hint="cs"/>
+                <w:b/>
+                <w:bCs/>
+                <w:sz w:val="28"/>
+                <w:szCs w:val="28"/>
+                <w:cs/>
+              </w:rPr>
+              <w:t xml:space="preserve">รายการ</w:t>
+            </w:r>
+          </w:p>
+        </w:tc>
+        <w:tc>
+          <w:tcPr>
+            <w:tcW w:w="2600" w:type="dxa"/>
+            <w:vAlign w:val="center"/>
+          </w:tcPr>
+          <w:p>
+            <w:pPr>
+              <w:spacing w:before="30" w:after="30" w:line="240" w:lineRule="auto"/>
+              <w:ind w:right="0"/>
+              <w:jc w:val="right"/>
+            </w:pPr>
+            <w:r>
+              <w:rPr>
+                <w:rFonts w:ascii="TH Sarabun New" w:hAnsi="TH Sarabun New" w:cs="TH Sarabun New" w:hint="cs"/>
+                <w:b/>
+                <w:bCs/>
+                <w:sz w:val="28"/>
+                <w:szCs w:val="28"/>
+                <w:cs/>
+              </w:rPr>
+              <w:t xml:space="preserve">จำนวนเงิน (บาท)</w:t>
+            </w:r>
+          </w:p>
+        </w:tc>
+      </w:tr>
+      <w:tr>
+        <w:tc>
+          <w:tcPr>
+            <w:tcW w:w="6900" w:type="dxa"/>
+            <w:tcBorders>
+              <w:bottom w:val="single" w:sz="16" w:space="0" w:color="000000"/>
+            </w:tcBorders>
+            <w:vAlign w:val="center"/>
+          </w:tcPr>
+          <w:p>
+            <w:pPr>
+              <w:spacing w:before="30" w:after="30" w:line="240" w:lineRule="auto"/>
+              <w:ind w:right="0"/>
+              <w:jc w:val="left"/>
+            </w:pPr>
+            <w:r>
+              <w:rPr>
+                <w:rFonts w:ascii="TH Sarabun New" w:hAnsi="TH Sarabun New" w:cs="TH Sarabun New" w:hint="cs"/>
+                <w:sz w:val="28"/>
+                <w:szCs w:val="28"/>
+                <w:cs/>
+              </w:rPr>
+              <w:t xml:space="preserve">เงินรางวัล </w:t>
+            </w:r>
+            <w:r>
+              <w:rPr>
+                <w:rFonts w:ascii="TH Sarabun New" w:hAnsi="TH Sarabun New" w:cs="TH Sarabun New"/>
+                <w:sz w:val="28"/>
+                <w:szCs w:val="28"/>
+              </w:rPr>
+              <w:t xml:space="preserve">{{quartile}}</w:t>
+            </w:r>
+            <w:r>
+              <w:rPr>
+                <w:rFonts w:ascii="TH Sarabun New" w:hAnsi="TH Sarabun New" w:cs="TH Sarabun New" w:hint="cs"/>
+                <w:sz w:val="28"/>
+                <w:szCs w:val="28"/>
+                <w:cs/>
+              </w:rPr>
+              <w:t xml:space="preserve">{{reward_received_note}}</w:t>
+            </w:r>
+          </w:p>
+        </w:tc>
+        <w:tc>
+          <w:tcPr>
+            <w:tcW w:w="2600" w:type="dxa"/>
+            <w:tcBorders>
+              <w:bottom w:val="single" w:sz="16" w:space="0" w:color="000000"/>
+            </w:tcBorders>
+            <w:vAlign w:val="center"/>
+          </w:tcPr>
+          <w:p>
+            <w:pPr>
+              <w:spacing w:before="30" w:after="30" w:line="240" w:lineRule="auto"/>
+              <w:ind w:right="0"/>
+              <w:jc w:val="right"/>
+            </w:pPr>
+            <w:r>
+              <w:rPr>
+                <w:rFonts w:ascii="TH Sarabun New" w:hAnsi="TH Sarabun New" w:cs="TH Sarabun New"/>
+                <w:sz w:val="28"/>
+                <w:szCs w:val="28"/>
+              </w:rPr>
+              <w:t xml:space="preserve">{{reward_amount}}</w:t>
+            </w:r>
+            <w:r>
+              <w:rPr>
+                <w:rFonts w:ascii="TH Sarabun New" w:hAnsi="TH Sarabun New" w:cs="TH Sarabun New" w:hint="cs"/>
+                <w:sz w:val="28"/>
+                <w:szCs w:val="28"/>
+                <w:cs/>
+              </w:rPr>
+              <w:t xml:space="preserve"> บาท</w:t>
+            </w:r>
+          </w:p>
+        </w:tc>
+      </w:tr>
+      <w:tr>
+        <w:tc>
+          <w:tcPr>
+            <w:tcW w:w="6900" w:type="dxa"/>
+            <w:vAlign w:val="center"/>
+          </w:tcPr>
+          <w:p>
+            <w:pPr>
+              <w:spacing w:before="30" w:after="30" w:line="240" w:lineRule="auto"/>
+              <w:ind w:right="0"/>
+              <w:jc w:val="left"/>
+            </w:pPr>
+            <w:r>
+              <w:rPr>
+                <w:rFonts w:ascii="TH Sarabun New" w:hAnsi="TH Sarabun New" w:cs="TH Sarabun New" w:hint="cs"/>
+                <w:sz w:val="28"/>
+                <w:szCs w:val="28"/>
+                <w:cs/>
+              </w:rPr>
+              <w:t xml:space="preserve">(A) ค่าปรับปรุงบทความ (Manuscript Editing Service)</w:t>
+            </w:r>
+          </w:p>
+        </w:tc>
+        <w:tc>
+          <w:tcPr>
+            <w:tcW w:w="2600" w:type="dxa"/>
+            <w:vAlign w:val="center"/>
+          </w:tcPr>
+          <w:p>
+            <w:pPr>
+              <w:spacing w:before="30" w:after="30" w:line="240" w:lineRule="auto"/>
+              <w:ind w:right="0"/>
+              <w:jc w:val="right"/>
+            </w:pPr>
+            <w:r>
+              <w:rPr>
+                <w:rFonts w:ascii="TH Sarabun New" w:hAnsi="TH Sarabun New" w:cs="TH Sarabun New"/>
+                <w:sz w:val="28"/>
+                <w:szCs w:val="28"/>
+              </w:rPr>
+              <w:t xml:space="preserve">{{manuscript_amount}}</w:t>
+            </w:r>
+            <w:r>
+              <w:rPr>
+                <w:rFonts w:ascii="TH Sarabun New" w:hAnsi="TH Sarabun New" w:cs="TH Sarabun New" w:hint="cs"/>
+                <w:sz w:val="28"/>
+                <w:szCs w:val="28"/>
+                <w:cs/>
+              </w:rPr>
+              <w:t xml:space="preserve"> บาท</w:t>
+            </w:r>
+          </w:p>
+        </w:tc>
+      </w:tr>
+      <w:tr>
+        <w:tc>
+          <w:tcPr>
+            <w:tcW w:w="6900" w:type="dxa"/>
+            <w:vAlign w:val="center"/>
+          </w:tcPr>
+          <w:p>
+            <w:pPr>
+              <w:spacing w:before="30" w:after="30" w:line="240" w:lineRule="auto"/>
+              <w:ind w:right="0"/>
+              <w:jc w:val="left"/>
+            </w:pPr>
+            <w:r>
+              <w:rPr>
+                <w:rFonts w:ascii="TH Sarabun New" w:hAnsi="TH Sarabun New" w:cs="TH Sarabun New" w:hint="cs"/>
+                <w:sz w:val="28"/>
+                <w:szCs w:val="28"/>
+                <w:cs/>
+              </w:rPr>
+              <w:t xml:space="preserve">(B) ค่าธรรมเนียมการตีพิมพ์ (Page Charge)</w:t>
+            </w:r>
+          </w:p>
+        </w:tc>
+        <w:tc>
+          <w:tcPr>
+            <w:tcW w:w="2600" w:type="dxa"/>
+            <w:vAlign w:val="center"/>
+          </w:tcPr>
+          <w:p>
+            <w:pPr>
+              <w:spacing w:before="30" w:after="30" w:line="240" w:lineRule="auto"/>
+              <w:ind w:right="0"/>
+              <w:jc w:val="right"/>
+            </w:pPr>
+            <w:r>
+              <w:rPr>
+                <w:rFonts w:ascii="TH Sarabun New" w:hAnsi="TH Sarabun New" w:cs="TH Sarabun New"/>
+                <w:sz w:val="28"/>
+                <w:szCs w:val="28"/>
+              </w:rPr>
+              <w:t xml:space="preserve">{{page_charge_amount}}</w:t>
+            </w:r>
+            <w:r>
+              <w:rPr>
+                <w:rFonts w:ascii="TH Sarabun New" w:hAnsi="TH Sarabun New" w:cs="TH Sarabun New" w:hint="cs"/>
+                <w:sz w:val="28"/>
+                <w:szCs w:val="28"/>
+                <w:cs/>
+              </w:rPr>
+              <w:t xml:space="preserve"> บาท</w:t>
+            </w:r>
+          </w:p>
+        </w:tc>
+      </w:tr>
+      <w:tr>
+        <w:tc>
+          <w:tcPr>
+            <w:tcW w:w="6900" w:type="dxa"/>
+            <w:vAlign w:val="center"/>
+          </w:tcPr>
+          <w:p>
+            <w:pPr>
+              <w:spacing w:before="30" w:after="30" w:line="240" w:lineRule="auto"/>
+              <w:ind w:left="480"/>
+              <w:jc w:val="left"/>
+            </w:pPr>
+            <w:r>
+              <w:rPr>
+                <w:rFonts w:ascii="TH Sarabun New" w:hAnsi="TH Sarabun New" w:cs="TH Sarabun New" w:hint="cs"/>
+                <w:sz w:val="28"/>
+                <w:szCs w:val="28"/>
+                <w:cs/>
+              </w:rPr>
+              <w:t xml:space="preserve">หัก (C) เงินที่มหาวิทยาลัยหรือหน่วยงานภายนอกสนับสนุน</w:t>
+            </w:r>
+            <w:r>
+              <w:rPr>
+                <w:rFonts w:ascii="TH Sarabun New" w:hAnsi="TH Sarabun New" w:cs="TH Sarabun New"/>
+                <w:sz w:val="28"/>
+                <w:szCs w:val="28"/>
+              </w:rPr>
+              <w:t xml:space="preserve">{{external_fund_block}}</w:t>
+            </w:r>
+          </w:p>
+        </w:tc>
+        <w:tc>
+          <w:tcPr>
+            <w:tcW w:w="2600" w:type="dxa"/>
+            <w:vAlign w:val="center"/>
+          </w:tcPr>
+          <w:p>
+            <w:pPr>
+              <w:spacing w:before="30" w:after="30" w:line="240" w:lineRule="auto"/>
+              <w:ind w:right="0"/>
+              <w:jc w:val="right"/>
+            </w:pPr>
+            <w:r>
+              <w:rPr>
+                <w:rFonts w:ascii="TH Sarabun New" w:hAnsi="TH Sarabun New" w:cs="TH Sarabun New"/>
+                <w:color w:val="C0392B"/>
+                <w:sz w:val="28"/>
+                <w:szCs w:val="28"/>
+              </w:rPr>
+              <w:t xml:space="preserve">{{external_fund_total_negative}}</w:t>
+            </w:r>
+            <w:r>
+              <w:rPr>
+                <w:rFonts w:ascii="TH Sarabun New" w:hAnsi="TH Sarabun New" w:cs="TH Sarabun New" w:hint="cs"/>
+                <w:color w:val="C0392B"/>
+                <w:sz w:val="28"/>
+                <w:szCs w:val="28"/>
+                <w:cs/>
+              </w:rPr>
+              <w:t xml:space="preserve"> บาท</w:t>
+            </w:r>
+          </w:p>
+        </w:tc>
+      </w:tr>
+      <w:tr>
+        <w:tc>
+          <w:tcPr>
+            <w:tcW w:w="6900" w:type="dxa"/>
+            <w:shd w:val="clear" w:color="auto" w:fill="F2F2F2"/>
+            <w:vAlign w:val="center"/>
+          </w:tcPr>
+          <w:p>
+            <w:pPr>
+              <w:spacing w:before="30" w:after="30" w:line="240" w:lineRule="auto"/>
+              <w:ind w:right="0"/>
+              <w:jc w:val="left"/>
+            </w:pPr>
+            <w:r>
+              <w:rPr>
+                <w:rFonts w:ascii="TH Sarabun New" w:hAnsi="TH Sarabun New" w:cs="TH Sarabun New" w:hint="cs"/>
+                <w:b/>
+                <w:bCs/>
+                <w:sz w:val="28"/>
+                <w:szCs w:val="28"/>
+                <w:cs/>
+              </w:rPr>
+              <w:t xml:space="preserve">เงินสมทบที่ขอเบิก (A + B - C)</w:t>
+            </w:r>
+          </w:p>
+        </w:tc>
+        <w:tc>
+          <w:tcPr>
+            <w:tcW w:w="2600" w:type="dxa"/>
+            <w:shd w:val="clear" w:color="auto" w:fill="F2F2F2"/>
+            <w:vAlign w:val="center"/>
+          </w:tcPr>
+          <w:p>
+            <w:pPr>
+              <w:spacing w:before="30" w:after="30" w:line="240" w:lineRule="auto"/>
+              <w:ind w:right="0"/>
+              <w:jc w:val="right"/>
+            </w:pPr>
+            <w:r>
+              <w:rPr>
+                <w:rFonts w:ascii="TH Sarabun New" w:hAnsi="TH Sarabun New" w:cs="TH Sarabun New"/>
+                <w:b/>
+                <w:bCs/>
+                <w:sz w:val="28"/>
+                <w:szCs w:val="28"/>
+              </w:rPr>
+              <w:t xml:space="preserve">{{net_topup_amount}}</w:t>
+            </w:r>
+            <w:r>
+              <w:rPr>
+                <w:rFonts w:ascii="TH Sarabun New" w:hAnsi="TH Sarabun New" w:cs="TH Sarabun New" w:hint="cs"/>
+                <w:b/>
+                <w:bCs/>
+                <w:sz w:val="28"/>
+                <w:szCs w:val="28"/>
+                <w:cs/>
+              </w:rPr>
+              <w:t xml:space="preserve"> บาท</w:t>
+            </w:r>
+          </w:p>
+        </w:tc>
+      </w:tr>
+      <w:tr>
+        <w:tc>
+          <w:tcPr>
+            <w:tcW w:w="6900" w:type="dxa"/>
+            <w:tcBorders>
+              <w:top w:val="single" w:sz="16" w:space="0" w:color="000000"/>
+              <w:bottom w:val="single" w:sz="16" w:space="0" w:color="000000"/>
+            </w:tcBorders>
+            <w:vAlign w:val="center"/>
+          </w:tcPr>
+          <w:p>
+            <w:pPr>
+              <w:spacing w:before="30" w:after="30" w:line="240" w:lineRule="auto"/>
+              <w:ind w:right="0"/>
+              <w:jc w:val="left"/>
+            </w:pPr>
+            <w:r>
+              <w:rPr>
+                <w:rFonts w:ascii="TH Sarabun New" w:hAnsi="TH Sarabun New" w:cs="TH Sarabun New" w:hint="cs"/>
+                <w:b/>
+                <w:bCs/>
+                <w:color w:val="1F4E79"/>
+                <w:sz w:val="28"/>
+                <w:szCs w:val="28"/>
+                <w:cs/>
+              </w:rPr>
+              <w:t xml:space="preserve">รวมจำนวนเงิน (Total Amount)</w:t>
+            </w:r>
+          </w:p>
+        </w:tc>
+        <w:tc>
+          <w:tcPr>
+            <w:tcW w:w="2600" w:type="dxa"/>
+            <w:tcBorders>
+              <w:top w:val="single" w:sz="16" w:space="0" w:color="000000"/>
+              <w:bottom w:val="single" w:sz="16" w:space="0" w:color="000000"/>
+            </w:tcBorders>
+            <w:vAlign w:val="center"/>
+          </w:tcPr>
+          <w:p>
+            <w:pPr>
+              <w:spacing w:before="30" w:after="30" w:line="240" w:lineRule="auto"/>
+              <w:ind w:right="0"/>
+              <w:jc w:val="right"/>
+            </w:pPr>
+            <w:r>
+              <w:rPr>
+                <w:rFonts w:ascii="TH Sarabun New" w:hAnsi="TH Sarabun New" w:cs="TH Sarabun New"/>
+                <w:b/>
+                <w:bCs/>
+                <w:color w:val="1F4E79"/>
+                <w:sz w:val="28"/>
+                <w:szCs w:val="28"/>
+              </w:rPr>
+              <w:t xml:space="preserve">{{total_amount}}</w:t>
+            </w:r>
+            <w:r>
+              <w:rPr>
+                <w:rFonts w:ascii="TH Sarabun New" w:hAnsi="TH Sarabun New" w:cs="TH Sarabun New" w:hint="cs"/>
+                <w:b/>
+                <w:bCs/>
+                <w:color w:val="1F4E79"/>
+                <w:sz w:val="28"/>
+                <w:szCs w:val="28"/>
+                <w:cs/>
+              </w:rPr>
+              <w:t xml:space="preserve"> บาท</w:t>
+            </w:r>
+          </w:p>
+        </w:tc>
+      </w:tr>
+    </w:tbl>
     <w:p>
       <w:pPr>
-        <w:ind w:right="43"/>
-        <w:rPr>
-          <w:rFonts w:ascii="TH Sarabun New" w:hAnsi="TH Sarabun New" w:cs="TH Sarabun New"/>
-          <w:sz w:val="28"/>
-          <w:szCs w:val="28"/>
-          <w:cs/>
-        </w:rPr>
-      </w:pPr>
-      <w:r>
-        <w:rPr>
-          <w:rFonts w:ascii="TH Sarabun New" w:hAnsi="TH Sarabun New" w:cs="TH Sarabun New"/>
-          <w:sz w:val="28"/>
-          <w:szCs w:val="28"/>
-        </w:rPr>
-        <w:t>{{external_</w:t>
-      </w:r>
-      <w:r>
-        <w:rPr>
-          <w:rFonts w:ascii="TH Sarabun New" w:hAnsi="TH Sarabun New" w:cs="TH Sarabun New"/>
-          <w:sz w:val="28"/>
-          <w:szCs w:val="28"/>
-        </w:rPr>
-        <w:t>fund_list</w:t>
-      </w:r>
-      <w:r>
-        <w:rPr>
-          <w:rFonts w:ascii="TH Sarabun New" w:hAnsi="TH Sarabun New" w:cs="TH Sarabun New"/>
-          <w:sz w:val="28"/>
-          <w:szCs w:val="28"/>
-        </w:rPr>
-        <w:t>}}</w:t>
-      </w:r>
-    </w:p>
-    <w:p>
-      <w:pPr>
-        <w:ind w:right="43"/>
-        <w:jc w:val="thaiDistribute"/>
-        <w:rPr>
-          <w:rFonts w:ascii="TH Sarabun New" w:hAnsi="TH Sarabun New" w:cs="TH Sarabun New"/>
-          <w:sz w:val="28"/>
-          <w:szCs w:val="28"/>
-          <w:cs/>
-        </w:rPr>
-      </w:pPr>
-      <w:r>
-        <w:rPr>
-          <w:rFonts w:ascii="TH Sarabun New" w:hAnsi="TH Sarabun New" w:cs="TH Sarabun New" w:hint="cs"/>
-          <w:sz w:val="28"/>
-          <w:szCs w:val="28"/>
-          <w:cs/>
-        </w:rPr>
-        <w:t>รวม</w:t>
-      </w:r>
-      <w:r>
-        <w:rPr>
-          <w:rFonts w:ascii="TH Sarabun New" w:hAnsi="TH Sarabun New" w:cs="TH Sarabun New"/>
-          <w:sz w:val="28"/>
-          <w:szCs w:val="28"/>
-          <w:cs/>
-        </w:rPr>
-        <w:t>จำนวนเงินที่มหาวิทยาลัยหรือหน่วยงานภายนอกสนับสนุน</w:t>
-      </w:r>
-      <w:r>
-        <w:rPr>
-          <w:rFonts w:ascii="TH Sarabun New" w:hAnsi="TH Sarabun New" w:cs="TH Sarabun New" w:hint="cs"/>
-          <w:sz w:val="28"/>
-          <w:szCs w:val="28"/>
-          <w:cs/>
-        </w:rPr>
-        <w:t xml:space="preserve"> </w:t>
-      </w:r>
-      <w:r>
-        <w:rPr>
-          <w:rFonts w:ascii="TH Sarabun New" w:hAnsi="TH Sarabun New" w:cs="TH Sarabun New"/>
-          <w:sz w:val="28"/>
-          <w:szCs w:val="28"/>
-        </w:rPr>
-        <w:t>{{external_fund_total}}</w:t>
-      </w:r>
-      <w:r>
-        <w:rPr>
-          <w:rFonts w:ascii="TH Sarabun New" w:hAnsi="TH Sarabun New" w:cs="TH Sarabun New"/>
-          <w:sz w:val="28"/>
-          <w:szCs w:val="28"/>
-        </w:rPr>
-        <w:t xml:space="preserve"> </w:t>
-      </w:r>
-      <w:r>
-        <w:rPr>
-          <w:rFonts w:ascii="TH Sarabun New" w:hAnsi="TH Sarabun New" w:cs="TH Sarabun New" w:hint="cs"/>
-          <w:sz w:val="28"/>
-          <w:szCs w:val="28"/>
-          <w:cs/>
-        </w:rPr>
-        <w:t>บาท</w:t>
-      </w:r>
+        <w:rPr>
+          <w:rFonts w:ascii="TH Sarabun New" w:hAnsi="TH Sarabun New" w:cs="TH Sarabun New"/>
+          <w:sz w:val="28"/>
+          <w:szCs w:val="28"/>
+        </w:rPr>
+      </w:pPr>
     </w:p>
     <w:p>
       <w:pPr>

</xml_diff>